<commit_message>
Replace sensitivity analysis with robustness analysis; add Navigation_System_Abdullah subsystem
</commit_message>
<xml_diff>
--- a/Delta-Robot-Subsystem/Paper Data for Delta Robot/AWRR_Delta_Robot_Section_updated.docx
+++ b/Delta-Robot-Subsystem/Paper Data for Delta Robot/AWRR_Delta_Robot_Section_updated.docx
@@ -183,15 +183,15 @@
         <w:spacing w:after="120" w:before="250"/>
       </w:pPr>
       <w:r>
-        <w:t xml:space="preserve">2.5 Workspace Characterization</w:t>
-      </w:r>
-    </w:p>
-    <w:p>
-      <w:pPr>
-        <w:spacing w:after="200"/>
-      </w:pPr>
-      <w:r>
-        <w:t xml:space="preserve">The reachable volume was estimated by exhaustive numerical sampling — a 20×20×20 grid spanning ±250 mm in X/Y and −50 mm to −250 mm in Z — retaining only points where all three legs return a valid IK solution. Maximum radial reach was computed from this sample set and overlaid on the 3D scatter as a boundary reference.</w:t>
+        <w:t>2.5 Workspace Characterization</w:t>
+      </w:r>
+    </w:p>
+    <w:p>
+      <w:pPr>
+        <w:spacing w:after="200"/>
+      </w:pPr>
+      <w:r>
+        <w:t>The reachable volume was estimated by exhaustive numerical sampling — a default 20×20×20 grid spanning ±250 mm in X/Y and −50 mm to −250 mm in Z — retaining only points where all three legs return a valid IK solution. Maximum radial reach was computed from this sample set and overlaid on the 3D scatter as a boundary reference. To ensure grid resolution convergence, the workspace was also sampled at resolutions of 10, 30, 40, and 50. With joint limits active, the maximum reachable radius converged from 208.0 mm (at resolution 20) to 212.2 mm (at resolution 50), demonstrating that the 20×20×20 grid characterizes the workspace envelope within 2% of the converged limit. When joint limits are neglected, the maximum horizontal reachable radius is found to be 253.1 mm (at resolution 20), matching previous simplified geometric analyses.</w:t>
       </w:r>
     </w:p>
     <w:p>
@@ -225,7 +225,7 @@
         <w:spacing w:after="200"/>
       </w:pPr>
       <w:r>
-        <w:t xml:space="preserve">Joint response was modeled as a second-order system — commanded torque (from a PID controller, saturated at estimated actuator stall torque) driving angular acceleration through rotational inertia J and viscous damping b. J combines an analytically derived arm-rod inertia term (J = ⅓·m·L², assuming a ~0.1 kg arm) with an estimated multiplier accounting for unmodeled reflected gearbox and lower-arm loading; this multiplier is an engineering estimate, not a separately derived value. b is estimated from a representative hobby servo's datasheet ratio of stall torque to no-load speed.</w:t>
+        <w:t>Joint response was modeled as a second-order system — commanded torque (from a PID controller, saturated at estimated actuator stall torque) driving angular acceleration through rotational inertia J and viscous damping b. J combines an analytically derived arm-rod inertia term (J = ⅓·m·L², assuming a ~0.1 kg arm) with an estimated multiplier accounting for unmodeled reflected gearbox and lower-arm loading; this multiplier is an engineering estimate, not a separately derived value. b is estimated from a representative hobby servo's datasheet ratio of stall torque to no-load speed. The PID controller gains (Kp = 0.08, Ki = 0.02, Kd = 0.008) were manually tuned in simulation to achieve rapid settling with minimal overshoot, rather than derived through formal tuning rules (e.g., Ziegler-Nichols or pole placement).</w:t>
       </w:r>
     </w:p>
     <w:p>
@@ -234,19 +234,15 @@
         <w:spacing w:after="120" w:before="250"/>
       </w:pPr>
       <w:r>
-        <w:t xml:space="preserve">2.8 Scope Note</w:t>
-      </w:r>
-    </w:p>
-    <w:p>
-      <w:pPr>
-        <w:spacing w:after="200"/>
-      </w:pPr>
-      <w:r>
-        <w:rPr>
-          <w:i/>
-          <w:iCs/>
-        </w:rPr>
-        <w:t xml:space="preserve">This subsystem was developed and validated entirely in simulation; no physical actuator or prototype was tested. All figures and tables in this section reflect simulated results.</w:t>
+        <w:t>2.8 Scope and Limitations</w:t>
+      </w:r>
+    </w:p>
+    <w:p>
+      <w:pPr>
+        <w:spacing w:after="200"/>
+      </w:pPr>
+      <w:r>
+        <w:t>This subsystem was developed and validated entirely in simulation; no physical actuator or prototype was tested. All figures and tables in this section reflect simulated results. Environmental collision modeling was not implemented; only self-collision (wrist clearance) is checked, leaving collisions with crops, soil, or the mobile platform base as limitations to be addressed in future work.</w:t>
       </w:r>
     </w:p>
     <w:p>
@@ -255,15 +251,15 @@
         <w:spacing w:after="120" w:before="250"/>
       </w:pPr>
       <w:r>
-        <w:t xml:space="preserve">2.9 Sensitivity Analysis Across Randomized Layouts</w:t>
-      </w:r>
-    </w:p>
-    <w:p>
-      <w:pPr>
-        <w:spacing w:after="200"/>
-      </w:pPr>
-      <w:r>
-        <w:t xml:space="preserve">Section 3.2's cycle-time and path-reduction figures come from one fixed 5-weed layout, which is enough to demonstrate the pipeline but not enough to say how it behaves in general. To check that, camera-frame weed detections were generated in batches of independent random scenarios — each scenario drawing a random weed count (3–8) and random detection coordinates inside the camera's field of view, with a minimum inter-weed spacing enforced so targets don't overlap. Each scenario was pushed through the same detection-to-cycle-time pipeline used elsewhere in this section: camera-to-robot-frame transform, per-point reachability check, greedy nearest-neighbor ordering, and cycle-time estimation. Twenty-five scenarios were generated this way (seed = 100, for reproducibility), and cycle time and path-length reduction were recorded per scenario rather than just once.</w:t>
+        <w:t>2.9 Robustness Analysis Across Randomized Scenarios</w:t>
+      </w:r>
+    </w:p>
+    <w:p>
+      <w:pPr>
+        <w:spacing w:after="200"/>
+      </w:pPr>
+      <w:r>
+        <w:t>Section 3.2's cycle-time and path-reduction figures come from one fixed 5-weed layout, which is enough to demonstrate the pipeline but not enough to say how it behaves in general. To evaluate robustness, camera-frame weed detections were generated in batches of independent random scenarios — each scenario drawing a random weed count (3–8) and random detection coordinates inside the camera's field of view, with a minimum inter-weed spacing enforced so targets do not overlap. Each scenario was pushed through the same detection-to-cycle-time pipeline: camera-to-robot-frame transform, per-point reachability check, greedy nearest-neighbor ordering, and cycle-time estimation. Additionally, to evaluate the optimality of the greedy nearest-neighbor heuristic, we compared it against an exact Traveling Salesperson Problem (TSP) solver computed via brute-force permutation (feasible due to the small count of 3–8 weeds). Twenty-five scenarios were generated this way (seed = 100, for reproducibility), and cycle time, path-length reduction vs. unsorted order, and path length relative to the exact optimal TSP tour were recorded.</w:t>
       </w:r>
     </w:p>
     <w:p>
@@ -760,11 +756,7 @@
           </w:tcPr>
           <w:p>
             <w:r>
-              <w:rPr>
-                <w:b/>
-                <w:bCs/>
-              </w:rPr>
-              <w:t xml:space="preserve">Metric</w:t>
+              <w:t>Metric</w:t>
             </w:r>
           </w:p>
         </w:tc>
@@ -776,11 +768,7 @@
           </w:tcPr>
           <w:p>
             <w:r>
-              <w:rPr>
-                <w:b/>
-                <w:bCs/>
-              </w:rPr>
-              <w:t xml:space="preserve">Value</w:t>
+              <w:t>Value</w:t>
             </w:r>
           </w:p>
         </w:tc>
@@ -793,7 +781,7 @@
           </w:tcPr>
           <w:p>
             <w:r>
-              <w:t xml:space="preserve">Reachable workspace radius</w:t>
+              <w:t>Reachable workspace radius (default res=20)</w:t>
             </w:r>
           </w:p>
         </w:tc>
@@ -804,7 +792,7 @@
           </w:tcPr>
           <w:p>
             <w:r>
-              <w:t xml:space="preserve">253.1 mm</w:t>
+              <w:t>208.0 mm</w:t>
             </w:r>
           </w:p>
         </w:tc>
@@ -817,7 +805,7 @@
           </w:tcPr>
           <w:p>
             <w:r>
-              <w:t xml:space="preserve">Path length — greedy nearest-neighbor</w:t>
+              <w:t>Path length — exact optimal TSP tour</w:t>
             </w:r>
           </w:p>
         </w:tc>
@@ -828,7 +816,7 @@
           </w:tcPr>
           <w:p>
             <w:r>
-              <w:t xml:space="preserve">758.2 mm</w:t>
+              <w:t>717.8 mm</w:t>
             </w:r>
           </w:p>
         </w:tc>
@@ -841,7 +829,7 @@
           </w:tcPr>
           <w:p>
             <w:r>
-              <w:t xml:space="preserve">Path length — unsorted detection order</w:t>
+              <w:t>Path length — greedy nearest-neighbor</w:t>
             </w:r>
           </w:p>
         </w:tc>
@@ -852,7 +840,7 @@
           </w:tcPr>
           <w:p>
             <w:r>
-              <w:t xml:space="preserve">990.1 mm</w:t>
+              <w:t>758.2 mm</w:t>
             </w:r>
           </w:p>
         </w:tc>
@@ -865,7 +853,7 @@
           </w:tcPr>
           <w:p>
             <w:r>
-              <w:t xml:space="preserve">Trajectory length reduction</w:t>
+              <w:t>Path length — unsorted detection order</w:t>
             </w:r>
           </w:p>
         </w:tc>
@@ -876,7 +864,7 @@
           </w:tcPr>
           <w:p>
             <w:r>
-              <w:t xml:space="preserve">23.4%</w:t>
+              <w:t>990.1 mm</w:t>
             </w:r>
           </w:p>
         </w:tc>
@@ -889,7 +877,7 @@
           </w:tcPr>
           <w:p>
             <w:r>
-              <w:t xml:space="preserve">Joint angle setpoint</w:t>
+              <w:t>Trajectory length reduction (greedy vs. unsorted)</w:t>
             </w:r>
           </w:p>
         </w:tc>
@@ -900,7 +888,7 @@
           </w:tcPr>
           <w:p>
             <w:r>
-              <w:t xml:space="preserve">45.0°</w:t>
+              <w:t>23.4%</w:t>
             </w:r>
           </w:p>
         </w:tc>
@@ -913,7 +901,7 @@
           </w:tcPr>
           <w:p>
             <w:r>
-              <w:t xml:space="preserve">Settled joint angle at t = 0.5 s</w:t>
+              <w:t>Trajectory length overhead (greedy vs. optimal)</w:t>
             </w:r>
           </w:p>
         </w:tc>
@@ -924,7 +912,51 @@
           </w:tcPr>
           <w:p>
             <w:r>
-              <w:t xml:space="preserve">45.3°</w:t>
+              <w:t>5.6%</w:t>
+            </w:r>
+          </w:p>
+        </w:tc>
+      </w:tr>
+      <w:tr>
+        <w:tc>
+          <w:tcPr>
+            <w:tcW w:type="dxa" w:w="5500"/>
+          </w:tcPr>
+          <w:p>
+            <w:r>
+              <w:t>Joint angle setpoint</w:t>
+            </w:r>
+          </w:p>
+        </w:tc>
+        <w:tc>
+          <w:tcPr>
+            <w:tcW w:type="dxa" w:w="3500"/>
+          </w:tcPr>
+          <w:p>
+            <w:r>
+              <w:t>45.0°</w:t>
+            </w:r>
+          </w:p>
+        </w:tc>
+      </w:tr>
+      <w:tr>
+        <w:tc>
+          <w:tcPr>
+            <w:tcW w:type="dxa" w:w="5500"/>
+          </w:tcPr>
+          <w:p>
+            <w:r>
+              <w:t>Settled joint angle at t = 0.5 s</w:t>
+            </w:r>
+          </w:p>
+        </w:tc>
+        <w:tc>
+          <w:tcPr>
+            <w:tcW w:type="dxa" w:w="3500"/>
+          </w:tcPr>
+          <w:p>
+            <w:r>
+              <w:t>45.3°</w:t>
             </w:r>
           </w:p>
         </w:tc>
@@ -941,15 +973,15 @@
         <w:spacing w:after="120" w:before="250"/>
       </w:pPr>
       <w:r>
-        <w:t xml:space="preserve">3.3 Sensitivity Results Across Randomized Layouts</w:t>
-      </w:r>
-    </w:p>
-    <w:p>
-      <w:pPr>
-        <w:spacing w:after="200"/>
-      </w:pPr>
-      <w:r>
-        <w:t xml:space="preserve">Table 3 summarizes cycle time and path-length reduction across the 25 randomized scenarios described in Section 2.9. Reachability also varied by scenario, since randomly placed weeds occasionally fall outside the operating envelope: of 133 total weeds generated across all scenarios, 113 (85.0%) were reachable without repositioning the mobile base.</w:t>
+        <w:t>3.3 Robustness Results Across Randomized Scenarios</w:t>
+      </w:r>
+    </w:p>
+    <w:p>
+      <w:pPr>
+        <w:spacing w:after="200"/>
+      </w:pPr>
+      <w:r>
+        <w:t>Table 3 summarizes cycle time, path-length reduction, and path overhead compared to the exact TSP optimal tour across the 25 randomized scenarios described in Section 2.9. Reachability also varied by scenario, since randomly placed weeds occasionally fall outside the operating envelope: of 133 total weeds generated across all scenarios, 113 (85.0%) were reachable without repositioning the mobile base.</w:t>
       </w:r>
     </w:p>
     <w:tbl>
@@ -968,6 +1000,7 @@
         <w:gridCol w:w="3200"/>
         <w:gridCol w:w="2900"/>
         <w:gridCol w:w="2900"/>
+        <w:gridCol w:w="2160"/>
       </w:tblGrid>
       <w:tr>
         <w:tc>
@@ -978,11 +1011,7 @@
           </w:tcPr>
           <w:p>
             <w:r>
-              <w:rPr>
-                <w:b/>
-                <w:bCs/>
-              </w:rPr>
-              <w:t xml:space="preserve">Statistic (n = 25 scenarios)</w:t>
+              <w:t>Statistic (n = 25 scenarios)</w:t>
             </w:r>
           </w:p>
         </w:tc>
@@ -994,11 +1023,7 @@
           </w:tcPr>
           <w:p>
             <w:r>
-              <w:rPr>
-                <w:b/>
-                <w:bCs/>
-              </w:rPr>
-              <w:t xml:space="preserve">Cycle time (s)</w:t>
+              <w:t>Cycle time (s)</w:t>
             </w:r>
           </w:p>
         </w:tc>
@@ -1010,11 +1035,17 @@
           </w:tcPr>
           <w:p>
             <w:r>
-              <w:rPr>
-                <w:b/>
-                <w:bCs/>
-              </w:rPr>
-              <w:t xml:space="preserve">Path length reduction (%)</w:t>
+              <w:t>Path length reduction (%)</w:t>
+            </w:r>
+          </w:p>
+        </w:tc>
+        <w:tc>
+          <w:tcPr>
+            <w:tcW w:type="dxa" w:w="2160"/>
+          </w:tcPr>
+          <w:p>
+            <w:r>
+              <w:t>Greedy overhead vs. optimal (%)</w:t>
             </w:r>
           </w:p>
         </w:tc>
@@ -1027,7 +1058,7 @@
           </w:tcPr>
           <w:p>
             <w:r>
-              <w:t xml:space="preserve">Mean</w:t>
+              <w:t>Mean</w:t>
             </w:r>
           </w:p>
         </w:tc>
@@ -1038,7 +1069,7 @@
           </w:tcPr>
           <w:p>
             <w:r>
-              <w:t xml:space="preserve">3.10</w:t>
+              <w:t>3.10</w:t>
             </w:r>
           </w:p>
         </w:tc>
@@ -1049,7 +1080,17 @@
           </w:tcPr>
           <w:p>
             <w:r>
-              <w:t xml:space="preserve">18.7</w:t>
+              <w:t>18.7</w:t>
+            </w:r>
+          </w:p>
+        </w:tc>
+        <w:tc>
+          <w:tcPr>
+            <w:tcW w:type="dxa" w:w="2160"/>
+          </w:tcPr>
+          <w:p>
+            <w:r>
+              <w:t>3.6</w:t>
             </w:r>
           </w:p>
         </w:tc>
@@ -1062,7 +1103,7 @@
           </w:tcPr>
           <w:p>
             <w:r>
-              <w:t xml:space="preserve">Std. dev.</w:t>
+              <w:t>Std. dev.</w:t>
             </w:r>
           </w:p>
         </w:tc>
@@ -1073,7 +1114,7 @@
           </w:tcPr>
           <w:p>
             <w:r>
-              <w:t xml:space="preserve">0.99</w:t>
+              <w:t>0.99</w:t>
             </w:r>
           </w:p>
         </w:tc>
@@ -1084,7 +1125,17 @@
           </w:tcPr>
           <w:p>
             <w:r>
-              <w:t xml:space="preserve">17.0</w:t>
+              <w:t>17.0</w:t>
+            </w:r>
+          </w:p>
+        </w:tc>
+        <w:tc>
+          <w:tcPr>
+            <w:tcW w:type="dxa" w:w="2160"/>
+          </w:tcPr>
+          <w:p>
+            <w:r>
+              <w:t>5.0</w:t>
             </w:r>
           </w:p>
         </w:tc>
@@ -1097,7 +1148,7 @@
           </w:tcPr>
           <w:p>
             <w:r>
-              <w:t xml:space="preserve">Min</w:t>
+              <w:t>Min</w:t>
             </w:r>
           </w:p>
         </w:tc>
@@ -1108,7 +1159,7 @@
           </w:tcPr>
           <w:p>
             <w:r>
-              <w:t xml:space="preserve">1.23</w:t>
+              <w:t>1.23</w:t>
             </w:r>
           </w:p>
         </w:tc>
@@ -1119,7 +1170,17 @@
           </w:tcPr>
           <w:p>
             <w:r>
-              <w:t xml:space="preserve">-5.9</w:t>
+              <w:t>-5.9</w:t>
+            </w:r>
+          </w:p>
+        </w:tc>
+        <w:tc>
+          <w:tcPr>
+            <w:tcW w:type="dxa" w:w="2160"/>
+          </w:tcPr>
+          <w:p>
+            <w:r>
+              <w:t>0.0</w:t>
             </w:r>
           </w:p>
         </w:tc>
@@ -1132,7 +1193,7 @@
           </w:tcPr>
           <w:p>
             <w:r>
-              <w:t xml:space="preserve">Max</w:t>
+              <w:t>Max</w:t>
             </w:r>
           </w:p>
         </w:tc>
@@ -1143,7 +1204,7 @@
           </w:tcPr>
           <w:p>
             <w:r>
-              <w:t xml:space="preserve">4.88</w:t>
+              <w:t>4.88</w:t>
             </w:r>
           </w:p>
         </w:tc>
@@ -1154,7 +1215,17 @@
           </w:tcPr>
           <w:p>
             <w:r>
-              <w:t xml:space="preserve">45.9</w:t>
+              <w:t>45.9</w:t>
+            </w:r>
+          </w:p>
+        </w:tc>
+        <w:tc>
+          <w:tcPr>
+            <w:tcW w:type="dxa" w:w="2160"/>
+          </w:tcPr>
+          <w:p>
+            <w:r>
+              <w:t>20.0</w:t>
             </w:r>
           </w:p>
         </w:tc>
@@ -1170,7 +1241,7 @@
         <w:spacing w:after="200"/>
       </w:pPr>
       <w:r>
-        <w:t xml:space="preserve">The single fixed-layout example in Table 2 (23.4% reduction) sits inside this spread but isn't representative of it on its own — path-length reduction ranged from a 5.9% loss (greedy ordering performing worse than the arbitrary detection order, which happens occasionally in small, sparse scenarios) up to a 45.9% reduction in larger, denser ones. Cycle time scaled with reachable weed count as expected, from 1.23 s up to 4.88 s across the batch.</w:t>
+        <w:t>The single fixed-layout example in Table 2 (23.4% reduction, 5.6% overhead vs. optimal) sits inside this spread but isn't representative of it on its own — path-length reduction ranged from a 5.9% loss (greedy ordering performing worse than the arbitrary detection order, which happens occasionally in small, sparse scenarios) up to a 45.9% reduction in larger, denser ones. On average, the greedy heuristic achieved path lengths within 3.6% of the exact TSP optimum, with a maximum overhead of 20.0% in the worst-case scenario. Cycle time scaled with reachable weed count as expected, from 1.23 s up to 4.88 s across the batch.</w:t>
       </w:r>
     </w:p>
     <w:p>
@@ -1225,11 +1296,7 @@
         <w:jc w:val="center"/>
       </w:pPr>
       <w:r>
-        <w:rPr>
-          <w:i/>
-          <w:iCs/>
-        </w:rPr>
-        <w:t xml:space="preserve">Figure 4a. Cycle time and path-length reduction across 25 randomized weed-detection scenarios (seed = 100), with the mean shown as a dashed line in each panel.</w:t>
+        <w:t>Figure 4a. Cycle time and path length comparison across 25 randomized weed-detection scenarios (seed = 100), comparing the unsorted order, greedy nearest-neighbor, and exact optimal TSP paths, with the mean cycle time shown as a dashed line on the left.</w:t>
       </w:r>
     </w:p>
     <w:p>
@@ -1293,11 +1360,7 @@
         <w:jc w:val="center"/>
       </w:pPr>
       <w:r>
-        <w:rPr>
-          <w:i/>
-          <w:iCs/>
-        </w:rPr>
-        <w:t xml:space="preserve">Figure 2a. 3D reachable workspace, sampled points colored by depth, with computed 253.1 mm boundary overlaid.</w:t>
+        <w:t>Figure 2a. 3D reachable workspace, sampled points colored by depth, with computed 208.0 mm limits-enforced boundary overlaid (253.1 mm if joint limits are neglected).</w:t>
       </w:r>
     </w:p>
     <w:p>

</xml_diff>